<commit_message>
fix(rbpp-pipeline): corrige la veille HAS du 02/09 — le bloc « Dernières RBPP » aux dates des pages HAS (PPA-DUI 24/06/2026, autisme 12/02/2026, habitat volet 2 25/11/2025, vie intime 12/02/2025 màj 14/11/2025), pages liées, deux projections retirées, flux RSS ; journal
Co-Authored-By: Claude Opus 5 <noreply@anthropic.com>
</commit_message>
<xml_diff>
--- a/sources/veille/2026-09-02_veille_has-actualite.docx
+++ b/sources/veille/2026-09-02_veille_has-actualite.docx
@@ -89,52 +89,127 @@
           <w:sz w:val="22"/>
           <w:szCs w:val="22"/>
         </w:rPr>
-        <w:t xml:space="preserve">• Aucune nouvelle RBPP publiée dans le secteur social et médico-social entre le 26 août et le 2 septembre 2026.</w:t>
-      </w:r>
-    </w:p>
-    <w:p>
-      <w:pPr>
-        <w:spacing w:after="80" w:before="0"/>
-        <w:ind w:left="431"/>
-      </w:pPr>
-      <w:r>
-        <w:rPr>
-          <w:rFonts w:ascii="Calibri" w:cs="Calibri" w:eastAsia="Calibri" w:hAnsi="Calibri"/>
-          <w:color w:val="1F2937"/>
-          <w:sz w:val="22"/>
-          <w:szCs w:val="22"/>
-        </w:rPr>
-        <w:t xml:space="preserve">• Période estivale : le rythme de publication de la HAS ralentit habituellement en juillet-août ; la prochaine vague de publications est attendue à l'automne 2026.</w:t>
-      </w:r>
-    </w:p>
-    <w:p>
-      <w:pPr>
-        <w:spacing w:after="80" w:before="0"/>
-        <w:ind w:left="431"/>
-      </w:pPr>
-      <w:r>
-        <w:rPr>
-          <w:rFonts w:ascii="Calibri" w:cs="Calibri" w:eastAsia="Calibri" w:hAnsi="Calibri"/>
-          <w:color w:val="1F2937"/>
-          <w:sz w:val="22"/>
-          <w:szCs w:val="22"/>
-        </w:rPr>
-        <w:t xml:space="preserve">• L'appel à candidatures pour la RBPP « Vie quotidienne des enfants de 3 à 11 ans en protection de l'enfance » se clôt le 4 septembre 2026 (groupe de travail ; publication finale attendue fin 2027).</w:t>
-      </w:r>
-    </w:p>
-    <w:p>
-      <w:pPr>
-        <w:spacing w:after="80" w:before="0"/>
-        <w:ind w:left="431"/>
-      </w:pPr>
-      <w:r>
-        <w:rPr>
-          <w:rFonts w:ascii="Calibri" w:cs="Calibri" w:eastAsia="Calibri" w:hAnsi="Calibri"/>
-          <w:color w:val="1F2937"/>
-          <w:sz w:val="22"/>
-          <w:szCs w:val="22"/>
-        </w:rPr>
-        <w:t xml:space="preserve">• La HAS a fêté ses 22 ans le 13 août 2026 et rappelle l'élargissement de ses missions au secteur social et médico-social.</w:t>
+        <w:t xml:space="preserve">• Aucune nouvelle RBPP publiée dans le secteur social et médico-social entre le 26 août et le 2 septembre 2026 — confirmé à la relecture du 21/09/2026 sur le flux RSS « Recommandations et guides » de la HAS (</w:t>
+      </w:r>
+      <w:hyperlink w:history="1" r:id="rIdC02rss">
+        <w:r>
+          <w:rPr>
+            <w:rFonts w:ascii="Calibri" w:cs="Calibri" w:eastAsia="Calibri" w:hAnsi="Calibri"/>
+            <w:color w:val="1155CC"/>
+            <w:sz w:val="22"/>
+            <w:szCs w:val="22"/>
+            <w:u w:val="single"/>
+          </w:rPr>
+          <w:t xml:space="preserve">has-sante.fr/feed/Rss2.jsp?id=p_3081452</w:t>
+        </w:r>
+      </w:hyperlink>
+      <w:r>
+        <w:rPr>
+          <w:rFonts w:ascii="Calibri" w:cs="Calibri" w:eastAsia="Calibri" w:hAnsi="Calibri"/>
+          <w:color w:val="1F2937"/>
+          <w:sz w:val="22"/>
+          <w:szCs w:val="22"/>
+        </w:rPr>
+        <w:t xml:space="preserve">) : aucune entrée du secteur datée de la fenêtre. </w:t>
+      </w:r>
+      <w:r>
+        <w:rPr>
+          <w:rFonts w:ascii="Calibri" w:cs="Calibri" w:eastAsia="Calibri" w:hAnsi="Calibri"/>
+          <w:i/>
+          <w:iCs/>
+          <w:color w:val="6B7280"/>
+          <w:sz w:val="20"/>
+          <w:szCs w:val="20"/>
+        </w:rPr>
+        <w:t xml:space="preserve">[Corrigé le 21/09/2026 : le constat du 2 septembre venait de WebSearch et d'une page index qui rend sa liste en JavaScript ; le flux, lisible en headless, le confirme.]</w:t>
+      </w:r>
+    </w:p>
+    <w:p>
+      <w:pPr>
+        <w:spacing w:after="80" w:before="0"/>
+        <w:ind w:left="431"/>
+      </w:pPr>
+      <w:r>
+        <w:rPr>
+          <w:rFonts w:ascii="Calibri" w:cs="Calibri" w:eastAsia="Calibri" w:hAnsi="Calibri"/>
+          <w:color w:val="1F2937"/>
+          <w:sz w:val="22"/>
+          <w:szCs w:val="22"/>
+        </w:rPr>
+        <w:t xml:space="preserve">• Période estivale : peu de publications HAS en juillet-août dans le secteur ; la dernière publication du secteur avant la fenêtre est la note de cadrage du 09/07/2026 (voir Rappel). </w:t>
+      </w:r>
+      <w:r>
+        <w:rPr>
+          <w:rFonts w:ascii="Calibri" w:cs="Calibri" w:eastAsia="Calibri" w:hAnsi="Calibri"/>
+          <w:i/>
+          <w:iCs/>
+          <w:color w:val="6B7280"/>
+          <w:sz w:val="20"/>
+          <w:szCs w:val="20"/>
+        </w:rPr>
+        <w:t xml:space="preserve">[Corrigé le 21/09/2026 : « la prochaine vague de publications est attendue à l'automne 2026 » était une projection sans source ; retirée.]</w:t>
+      </w:r>
+    </w:p>
+    <w:p>
+      <w:pPr>
+        <w:spacing w:after="80" w:before="0"/>
+        <w:ind w:left="431"/>
+      </w:pPr>
+      <w:r>
+        <w:rPr>
+          <w:rFonts w:ascii="Calibri" w:cs="Calibri" w:eastAsia="Calibri" w:hAnsi="Calibri"/>
+          <w:color w:val="1F2937"/>
+          <w:sz w:val="22"/>
+          <w:szCs w:val="22"/>
+        </w:rPr>
+        <w:t xml:space="preserve">• L'appel à candidatures pour la RBPP « Vie quotidienne des enfants de 3 à 11 ans en protection de l'enfance » se clôt le 4 septembre 2026 (groupe de travail ; passage en commission prévu au 4e trimestre 2027 par la note de cadrage du 07/07/2026 — voir À venir).</w:t>
+      </w:r>
+      <w:r>
+        <w:rPr>
+          <w:rFonts w:ascii="Calibri" w:cs="Calibri" w:eastAsia="Calibri" w:hAnsi="Calibri"/>
+          <w:i/>
+          <w:iCs/>
+          <w:color w:val="6B7280"/>
+          <w:sz w:val="20"/>
+          <w:szCs w:val="20"/>
+        </w:rPr>
+        <w:t xml:space="preserve"> [Corrigé le 21/09/2026 : « publication finale attendue fin 2027 » devient la date de la note de cadrage, telle qu'elle l'écrit.]</w:t>
+      </w:r>
+    </w:p>
+    <w:p>
+      <w:pPr>
+        <w:spacing w:after="80" w:before="0"/>
+        <w:ind w:left="431"/>
+      </w:pPr>
+      <w:r>
+        <w:rPr>
+          <w:rFonts w:ascii="Calibri" w:cs="Calibri" w:eastAsia="Calibri" w:hAnsi="Calibri"/>
+          <w:color w:val="1F2937"/>
+          <w:sz w:val="22"/>
+          <w:szCs w:val="22"/>
+        </w:rPr>
+        <w:t xml:space="preserve">• La HAS a fêté ses 22 ans le 13 août 2026 et rappelle l'élargissement de ses missions au secteur social et médico-social (</w:t>
+      </w:r>
+      <w:hyperlink w:history="1" r:id="rIdC02ans">
+        <w:r>
+          <w:rPr>
+            <w:rFonts w:ascii="Calibri" w:cs="Calibri" w:eastAsia="Calibri" w:hAnsi="Calibri"/>
+            <w:color w:val="1155CC"/>
+            <w:sz w:val="22"/>
+            <w:szCs w:val="22"/>
+            <w:u w:val="single"/>
+          </w:rPr>
+          <w:t xml:space="preserve">article HAS du 13 août 2026</w:t>
+        </w:r>
+      </w:hyperlink>
+      <w:r>
+        <w:rPr>
+          <w:rFonts w:ascii="Calibri" w:cs="Calibri" w:eastAsia="Calibri" w:hAnsi="Calibri"/>
+          <w:color w:val="1F2937"/>
+          <w:sz w:val="22"/>
+          <w:szCs w:val="22"/>
+        </w:rPr>
+        <w:t xml:space="preserve">).</w:t>
       </w:r>
     </w:p>
     <w:p>
@@ -460,7 +535,7 @@
           <w:sz w:val="22"/>
           <w:szCs w:val="22"/>
         </w:rPr>
-        <w:t xml:space="preserve">• RBPP « Vie quotidienne en protection de l'enfance » (à suivre dès fin 2027) : concerne les foyers de l'enfance, MECS, pouponnières — pas directement les foyers d'hébergement pour adultes handicapés. À surveiller pour les ESSMS accueillant des adolescents en situation de handicap.</w:t>
+        <w:t xml:space="preserve">• RBPP « Vie quotidienne en protection de l'enfance » (passage en commission au 4e trimestre 2027 selon la note de cadrage) : concerne les foyers de l'enfance, MECS, pouponnières — pas directement les foyers d'hébergement pour adultes handicapés. À surveiller pour les ESSMS accueillant des adolescents en situation de handicap.</w:t>
       </w:r>
     </w:p>
     <w:p>
@@ -536,67 +611,162 @@
           <w:sz w:val="22"/>
           <w:szCs w:val="22"/>
         </w:rPr>
-        <w:t xml:space="preserve">Dernières RBPP publiées (antérieures à la fenêtre de veille) :</w:t>
-      </w:r>
-    </w:p>
-    <w:p>
-      <w:pPr>
-        <w:spacing w:after="80" w:before="0"/>
-        <w:ind w:left="431"/>
-      </w:pPr>
-      <w:r>
-        <w:rPr>
-          <w:rFonts w:ascii="Calibri" w:cs="Calibri" w:eastAsia="Calibri" w:hAnsi="Calibri"/>
-          <w:color w:val="1F2937"/>
-          <w:sz w:val="22"/>
-          <w:szCs w:val="22"/>
-        </w:rPr>
-        <w:t xml:space="preserve">• 27/06/2026 — RBPP sur le plan personnalisé d'accompagnement et le DUI (PPA-DUI)</w:t>
-      </w:r>
-    </w:p>
-    <w:p>
-      <w:pPr>
-        <w:spacing w:after="80" w:before="0"/>
-        <w:ind w:left="431"/>
-      </w:pPr>
-      <w:r>
-        <w:rPr>
-          <w:rFonts w:ascii="Calibri" w:cs="Calibri" w:eastAsia="Calibri" w:hAnsi="Calibri"/>
-          <w:color w:val="1F2937"/>
-          <w:sz w:val="22"/>
-          <w:szCs w:val="22"/>
-        </w:rPr>
-        <w:t xml:space="preserve">• 22/06/2026 — RBPP sur la vie intime, affective et sexuelle (volet 1 – socle transversal) [rectif : publication initiale 12/02/2025 ; dernière actualisation 22/06/2026]</w:t>
-      </w:r>
-    </w:p>
-    <w:p>
-      <w:pPr>
-        <w:spacing w:after="80" w:before="0"/>
-        <w:ind w:left="431"/>
-      </w:pPr>
-      <w:r>
-        <w:rPr>
-          <w:rFonts w:ascii="Calibri" w:cs="Calibri" w:eastAsia="Calibri" w:hAnsi="Calibri"/>
-          <w:color w:val="1F2937"/>
-          <w:sz w:val="22"/>
-          <w:szCs w:val="22"/>
-        </w:rPr>
-        <w:t xml:space="preserve">• 15/06/2026 — RBPP Habitat volet 2</w:t>
-      </w:r>
-    </w:p>
-    <w:p>
-      <w:pPr>
-        <w:spacing w:after="80" w:before="0"/>
-        <w:ind w:left="431"/>
-      </w:pPr>
-      <w:r>
-        <w:rPr>
-          <w:rFonts w:ascii="Calibri" w:cs="Calibri" w:eastAsia="Calibri" w:hAnsi="Calibri"/>
-          <w:color w:val="1F2937"/>
-          <w:sz w:val="22"/>
-          <w:szCs w:val="22"/>
-        </w:rPr>
-        <w:t xml:space="preserve">• 06/06/2026 — RBPP Autisme – recommandations mises à jour</w:t>
+        <w:t xml:space="preserve">Dernières RBPP publiées, antérieures à la fenêtre de veille (dates du site HAS, pages ouvertes le 21/09/2026) : </w:t>
+      </w:r>
+      <w:r>
+        <w:rPr>
+          <w:rFonts w:ascii="Calibri" w:cs="Calibri" w:eastAsia="Calibri" w:hAnsi="Calibri"/>
+          <w:i/>
+          <w:iCs/>
+          <w:color w:val="6B7280"/>
+          <w:sz w:val="20"/>
+          <w:szCs w:val="20"/>
+        </w:rPr>
+        <w:t xml:space="preserve">[Corrigé le 21/09/2026 : les quatre dates de ce bloc étaient celles des fichiers de veille du dépôt (27/06, 22/06, 15/06, 06/06), pas celles de la HAS.]</w:t>
+      </w:r>
+    </w:p>
+    <w:p>
+      <w:pPr>
+        <w:spacing w:after="80" w:before="0"/>
+        <w:ind w:left="431"/>
+      </w:pPr>
+      <w:r>
+        <w:rPr>
+          <w:rFonts w:ascii="Calibri" w:cs="Calibri" w:eastAsia="Calibri" w:hAnsi="Calibri"/>
+          <w:color w:val="1F2937"/>
+          <w:sz w:val="22"/>
+          <w:szCs w:val="22"/>
+        </w:rPr>
+        <w:t xml:space="preserve">• 24/06/2026 — Guide « Élaborer le Projet Personnalisé d'Accompagnement (PPA) dans le Dossier Usager Informatisé (DUI) » (</w:t>
+      </w:r>
+      <w:hyperlink w:history="1" r:id="rIdC02ppa">
+        <w:r>
+          <w:rPr>
+            <w:rFonts w:ascii="Calibri" w:cs="Calibri" w:eastAsia="Calibri" w:hAnsi="Calibri"/>
+            <w:color w:val="1155CC"/>
+            <w:sz w:val="22"/>
+            <w:szCs w:val="22"/>
+            <w:u w:val="single"/>
+          </w:rPr>
+          <w:t xml:space="preserve">has-sante.fr/jcms/p_3604128</w:t>
+        </w:r>
+      </w:hyperlink>
+      <w:r>
+        <w:rPr>
+          <w:rFonts w:ascii="Calibri" w:cs="Calibri" w:eastAsia="Calibri" w:hAnsi="Calibri"/>
+          <w:color w:val="1F2937"/>
+          <w:sz w:val="22"/>
+          <w:szCs w:val="22"/>
+        </w:rPr>
+        <w:t xml:space="preserve">) — validé le 12 mai 2026, mis en ligne le 24 juin 2026</w:t>
+      </w:r>
+    </w:p>
+    <w:p>
+      <w:pPr>
+        <w:spacing w:after="80" w:before="0"/>
+        <w:ind w:left="431"/>
+      </w:pPr>
+      <w:r>
+        <w:rPr>
+          <w:rFonts w:ascii="Calibri" w:cs="Calibri" w:eastAsia="Calibri" w:hAnsi="Calibri"/>
+          <w:color w:val="1F2937"/>
+          <w:sz w:val="22"/>
+          <w:szCs w:val="22"/>
+        </w:rPr>
+        <w:t xml:space="preserve">• 12/02/2026 — RBPP « Trouble du spectre de l'autisme : interventions et parcours de vie du nourrisson, de l'enfant et de l'adolescent » (</w:t>
+      </w:r>
+      <w:hyperlink w:history="1" r:id="rIdC02tsa">
+        <w:r>
+          <w:rPr>
+            <w:rFonts w:ascii="Calibri" w:cs="Calibri" w:eastAsia="Calibri" w:hAnsi="Calibri"/>
+            <w:color w:val="1155CC"/>
+            <w:sz w:val="22"/>
+            <w:szCs w:val="22"/>
+            <w:u w:val="single"/>
+          </w:rPr>
+          <w:t xml:space="preserve">has-sante.fr/jcms/p_3448980</w:t>
+        </w:r>
+      </w:hyperlink>
+      <w:r>
+        <w:rPr>
+          <w:rFonts w:ascii="Calibri" w:cs="Calibri" w:eastAsia="Calibri" w:hAnsi="Calibri"/>
+          <w:color w:val="1F2937"/>
+          <w:sz w:val="22"/>
+          <w:szCs w:val="22"/>
+        </w:rPr>
+        <w:t xml:space="preserve">) — validée le 08 janvier 2026, mise en ligne le 12 févr. 2026</w:t>
+      </w:r>
+    </w:p>
+    <w:p>
+      <w:pPr>
+        <w:spacing w:after="80" w:before="0"/>
+        <w:ind w:left="431"/>
+      </w:pPr>
+      <w:r>
+        <w:rPr>
+          <w:rFonts w:ascii="Calibri" w:cs="Calibri" w:eastAsia="Calibri" w:hAnsi="Calibri"/>
+          <w:color w:val="1F2937"/>
+          <w:sz w:val="22"/>
+          <w:szCs w:val="22"/>
+        </w:rPr>
+        <w:t xml:space="preserve">• 25/11/2025 — RBPP « L'accompagnement vers et dans l'habitat par les professionnels des ESSMS – Volet 2 : accompagner la personne dans l'élaboration de son projet d'habitat » (</w:t>
+      </w:r>
+      <w:hyperlink w:history="1" r:id="rIdC02hab2">
+        <w:r>
+          <w:rPr>
+            <w:rFonts w:ascii="Calibri" w:cs="Calibri" w:eastAsia="Calibri" w:hAnsi="Calibri"/>
+            <w:color w:val="1155CC"/>
+            <w:sz w:val="22"/>
+            <w:szCs w:val="22"/>
+            <w:u w:val="single"/>
+          </w:rPr>
+          <w:t xml:space="preserve">has-sante.fr/jcms/p_3750698</w:t>
+        </w:r>
+      </w:hyperlink>
+      <w:r>
+        <w:rPr>
+          <w:rFonts w:ascii="Calibri" w:cs="Calibri" w:eastAsia="Calibri" w:hAnsi="Calibri"/>
+          <w:color w:val="1F2937"/>
+          <w:sz w:val="22"/>
+          <w:szCs w:val="22"/>
+        </w:rPr>
+        <w:t xml:space="preserve">) — validée le 04 novembre 2025, mise en ligne le 25 nov. 2025</w:t>
+      </w:r>
+    </w:p>
+    <w:p>
+      <w:pPr>
+        <w:spacing w:after="80" w:before="0"/>
+        <w:ind w:left="431"/>
+      </w:pPr>
+      <w:r>
+        <w:rPr>
+          <w:rFonts w:ascii="Calibri" w:cs="Calibri" w:eastAsia="Calibri" w:hAnsi="Calibri"/>
+          <w:color w:val="1F2937"/>
+          <w:sz w:val="22"/>
+          <w:szCs w:val="22"/>
+        </w:rPr>
+        <w:t xml:space="preserve">• 12/02/2025 — RBPP « Accompagner la vie intime, affective et sexuelle des personnes en ESSMS (volet 1 - socle transversal) » (</w:t>
+      </w:r>
+      <w:hyperlink w:history="1" r:id="rIdC02vias">
+        <w:r>
+          <w:rPr>
+            <w:rFonts w:ascii="Calibri" w:cs="Calibri" w:eastAsia="Calibri" w:hAnsi="Calibri"/>
+            <w:color w:val="1155CC"/>
+            <w:sz w:val="22"/>
+            <w:szCs w:val="22"/>
+            <w:u w:val="single"/>
+          </w:rPr>
+          <w:t xml:space="preserve">has-sante.fr/jcms/p_3590098</w:t>
+        </w:r>
+      </w:hyperlink>
+      <w:r>
+        <w:rPr>
+          <w:rFonts w:ascii="Calibri" w:cs="Calibri" w:eastAsia="Calibri" w:hAnsi="Calibri"/>
+          <w:color w:val="1F2937"/>
+          <w:sz w:val="22"/>
+          <w:szCs w:val="22"/>
+        </w:rPr>
+        <w:t xml:space="preserve">) — validée le 14 janvier 2025, mise en ligne le 12 févr. 2025 ; la page porte « Mise à jour 14/11/2025 » (loi n° 2025-1057 du 6 novembre 2025)</w:t>
       </w:r>
     </w:p>
     <w:p/>
@@ -805,6 +975,186 @@
         </w:r>
       </w:hyperlink>
     </w:p>
+    <w:p>
+      <w:pPr>
+        <w:spacing w:after="80" w:before="0"/>
+        <w:ind w:left="431"/>
+      </w:pPr>
+      <w:r>
+        <w:rPr>
+          <w:rFonts w:ascii="Calibri" w:cs="Calibri" w:eastAsia="Calibri" w:hAnsi="Calibri"/>
+          <w:color w:val="1F2937"/>
+          <w:sz w:val="22"/>
+          <w:szCs w:val="22"/>
+        </w:rPr>
+        <w:t xml:space="preserve">✅ </w:t>
+      </w:r>
+      <w:hyperlink w:history="1" r:id="rIdC02rss">
+        <w:r>
+          <w:rPr>
+            <w:rFonts w:ascii="Calibri" w:cs="Calibri" w:eastAsia="Calibri" w:hAnsi="Calibri"/>
+            <w:color w:val="1155CC"/>
+            <w:sz w:val="22"/>
+            <w:szCs w:val="22"/>
+            <w:u w:val="single"/>
+          </w:rPr>
+          <w:t xml:space="preserve">HAS — flux RSS « Recommandations et guides » (lu le 21/09/2026 à la relecture)</w:t>
+        </w:r>
+      </w:hyperlink>
+      <w:r>
+        <w:rPr>
+          <w:rFonts w:ascii="Calibri" w:cs="Calibri" w:eastAsia="Calibri" w:hAnsi="Calibri"/>
+          <w:color w:val="1F2937"/>
+          <w:sz w:val="22"/>
+          <w:szCs w:val="22"/>
+        </w:rPr>
+        <w:t xml:space="preserve"/>
+      </w:r>
+    </w:p>
+    <w:p>
+      <w:pPr>
+        <w:spacing w:after="80" w:before="0"/>
+        <w:ind w:left="431"/>
+      </w:pPr>
+      <w:r>
+        <w:rPr>
+          <w:rFonts w:ascii="Calibri" w:cs="Calibri" w:eastAsia="Calibri" w:hAnsi="Calibri"/>
+          <w:color w:val="1F2937"/>
+          <w:sz w:val="22"/>
+          <w:szCs w:val="22"/>
+        </w:rPr>
+        <w:t xml:space="preserve">✅ </w:t>
+      </w:r>
+      <w:hyperlink w:history="1" r:id="rIdC02ppa">
+        <w:r>
+          <w:rPr>
+            <w:rFonts w:ascii="Calibri" w:cs="Calibri" w:eastAsia="Calibri" w:hAnsi="Calibri"/>
+            <w:color w:val="1155CC"/>
+            <w:sz w:val="22"/>
+            <w:szCs w:val="22"/>
+            <w:u w:val="single"/>
+          </w:rPr>
+          <w:t xml:space="preserve">HAS — Guide PPA dans le DUI (validé le 12/05/2026, mis en ligne le 24/06/2026) [ajouté à la relecture du 21/09/2026]</w:t>
+        </w:r>
+      </w:hyperlink>
+      <w:r>
+        <w:rPr>
+          <w:rFonts w:ascii="Calibri" w:cs="Calibri" w:eastAsia="Calibri" w:hAnsi="Calibri"/>
+          <w:color w:val="1F2937"/>
+          <w:sz w:val="22"/>
+          <w:szCs w:val="22"/>
+        </w:rPr>
+        <w:t xml:space="preserve"/>
+      </w:r>
+    </w:p>
+    <w:p>
+      <w:pPr>
+        <w:spacing w:after="80" w:before="0"/>
+        <w:ind w:left="431"/>
+      </w:pPr>
+      <w:r>
+        <w:rPr>
+          <w:rFonts w:ascii="Calibri" w:cs="Calibri" w:eastAsia="Calibri" w:hAnsi="Calibri"/>
+          <w:color w:val="1F2937"/>
+          <w:sz w:val="22"/>
+          <w:szCs w:val="22"/>
+        </w:rPr>
+        <w:t xml:space="preserve">✅ </w:t>
+      </w:r>
+      <w:hyperlink w:history="1" r:id="rIdC02tsa">
+        <w:r>
+          <w:rPr>
+            <w:rFonts w:ascii="Calibri" w:cs="Calibri" w:eastAsia="Calibri" w:hAnsi="Calibri"/>
+            <w:color w:val="1155CC"/>
+            <w:sz w:val="22"/>
+            <w:szCs w:val="22"/>
+            <w:u w:val="single"/>
+          </w:rPr>
+          <w:t xml:space="preserve">HAS — RBPP Trouble du spectre de l'autisme : interventions et parcours de vie du nourrisson, de l'enfant et de l'adolescent (validée le 08/01/2026, mise en ligne le 12/02/2026) [ajouté à la relecture du 21/09/2026]</w:t>
+        </w:r>
+      </w:hyperlink>
+      <w:r>
+        <w:rPr>
+          <w:rFonts w:ascii="Calibri" w:cs="Calibri" w:eastAsia="Calibri" w:hAnsi="Calibri"/>
+          <w:color w:val="1F2937"/>
+          <w:sz w:val="22"/>
+          <w:szCs w:val="22"/>
+        </w:rPr>
+        <w:t xml:space="preserve"/>
+      </w:r>
+    </w:p>
+    <w:p>
+      <w:pPr>
+        <w:spacing w:after="80" w:before="0"/>
+        <w:ind w:left="431"/>
+      </w:pPr>
+      <w:r>
+        <w:rPr>
+          <w:rFonts w:ascii="Calibri" w:cs="Calibri" w:eastAsia="Calibri" w:hAnsi="Calibri"/>
+          <w:color w:val="1F2937"/>
+          <w:sz w:val="22"/>
+          <w:szCs w:val="22"/>
+        </w:rPr>
+        <w:t xml:space="preserve">✅ </w:t>
+      </w:r>
+      <w:hyperlink w:history="1" r:id="rIdC02hab2">
+        <w:r>
+          <w:rPr>
+            <w:rFonts w:ascii="Calibri" w:cs="Calibri" w:eastAsia="Calibri" w:hAnsi="Calibri"/>
+            <w:color w:val="1155CC"/>
+            <w:sz w:val="22"/>
+            <w:szCs w:val="22"/>
+            <w:u w:val="single"/>
+          </w:rPr>
+          <w:t xml:space="preserve">HAS — RBPP Accompagnement vers et dans l'habitat – volet 2 (validée le 04/11/2025, mise en ligne le 25/11/2025) [ajouté à la relecture du 21/09/2026]</w:t>
+        </w:r>
+      </w:hyperlink>
+      <w:r>
+        <w:rPr>
+          <w:rFonts w:ascii="Calibri" w:cs="Calibri" w:eastAsia="Calibri" w:hAnsi="Calibri"/>
+          <w:color w:val="1F2937"/>
+          <w:sz w:val="22"/>
+          <w:szCs w:val="22"/>
+        </w:rPr>
+        <w:t xml:space="preserve"/>
+      </w:r>
+    </w:p>
+    <w:p>
+      <w:pPr>
+        <w:spacing w:after="80" w:before="0"/>
+        <w:ind w:left="431"/>
+      </w:pPr>
+      <w:r>
+        <w:rPr>
+          <w:rFonts w:ascii="Calibri" w:cs="Calibri" w:eastAsia="Calibri" w:hAnsi="Calibri"/>
+          <w:color w:val="1F2937"/>
+          <w:sz w:val="22"/>
+          <w:szCs w:val="22"/>
+        </w:rPr>
+        <w:t xml:space="preserve">✅ </w:t>
+      </w:r>
+      <w:hyperlink w:history="1" r:id="rIdC02ans">
+        <w:r>
+          <w:rPr>
+            <w:rFonts w:ascii="Calibri" w:cs="Calibri" w:eastAsia="Calibri" w:hAnsi="Calibri"/>
+            <w:color w:val="1155CC"/>
+            <w:sz w:val="22"/>
+            <w:szCs w:val="22"/>
+            <w:u w:val="single"/>
+          </w:rPr>
+          <w:t xml:space="preserve">HAS — La HAS fête ses 22 ans (article du 13/08/2026) [ajouté à la relecture du 21/09/2026]</w:t>
+        </w:r>
+      </w:hyperlink>
+      <w:r>
+        <w:rPr>
+          <w:rFonts w:ascii="Calibri" w:cs="Calibri" w:eastAsia="Calibri" w:hAnsi="Calibri"/>
+          <w:color w:val="1F2937"/>
+          <w:sz w:val="22"/>
+          <w:szCs w:val="22"/>
+        </w:rPr>
+        <w:t xml:space="preserve"/>
+      </w:r>
+    </w:p>
     <w:p/>
     <w:p>
       <w:pPr>
@@ -829,6 +1179,175 @@
           <w:szCs w:val="18"/>
         </w:rPr>
         <w:t xml:space="preserve">Note produite automatiquement — Job rbpp-pipeline — 2 septembre 2026 | Pour usage interne ESSMS uniquement</w:t>
+      </w:r>
+    </w:p>
+    <w:p>
+      <w:pPr>
+        <w:pStyle w:val="Heading2"/>
+        <w:spacing w:after="100" w:before="280"/>
+      </w:pPr>
+      <w:r>
+        <w:rPr>
+          <w:rFonts w:ascii="Calibri" w:cs="Calibri" w:eastAsia="Calibri" w:hAnsi="Calibri"/>
+          <w:b/>
+          <w:bCs/>
+          <w:color w:val="1B3A6B"/>
+          <w:sz w:val="28"/>
+          <w:szCs w:val="28"/>
+        </w:rPr>
+        <w:t xml:space="preserve">📝 Journal des corrections (21/09/2026)</w:t>
+      </w:r>
+    </w:p>
+    <w:p>
+      <w:pPr>
+        <w:spacing w:after="120" w:before="0"/>
+      </w:pPr>
+      <w:r>
+        <w:rPr>
+          <w:rFonts w:ascii="Calibri" w:cs="Calibri" w:eastAsia="Calibri" w:hAnsi="Calibri"/>
+          <w:i/>
+          <w:iCs/>
+          <w:color w:val="6B7280"/>
+          <w:sz w:val="20"/>
+          <w:szCs w:val="20"/>
+        </w:rPr>
+        <w:t xml:space="preserve">Relecture du 21/09/2026 : pages HAS rouvertes avec un agent de navigateur, flux RSS lu. Les corrections sont intégrées au texte, marquées [Corrigé le 21/09/2026 : …]. Formulations d'origine :</w:t>
+      </w:r>
+    </w:p>
+    <w:p>
+      <w:pPr>
+        <w:spacing w:after="80" w:before="0"/>
+        <w:ind w:left="431"/>
+      </w:pPr>
+      <w:r>
+        <w:rPr>
+          <w:rFonts w:ascii="Calibri" w:cs="Calibri" w:eastAsia="Calibri" w:hAnsi="Calibri"/>
+          <w:i/>
+          <w:iCs/>
+          <w:color w:val="6B7280"/>
+          <w:sz w:val="20"/>
+          <w:szCs w:val="20"/>
+        </w:rPr>
+        <w:t xml:space="preserve">• En bref : « Aucune nouvelle RBPP publiée … entre le 26 août et le 2 septembre 2026 » — sans source lisible ; confirmé sur le flux RSS de la HAS le 21/09/2026.</w:t>
+      </w:r>
+    </w:p>
+    <w:p>
+      <w:pPr>
+        <w:spacing w:after="80" w:before="0"/>
+        <w:ind w:left="431"/>
+      </w:pPr>
+      <w:r>
+        <w:rPr>
+          <w:rFonts w:ascii="Calibri" w:cs="Calibri" w:eastAsia="Calibri" w:hAnsi="Calibri"/>
+          <w:i/>
+          <w:iCs/>
+          <w:color w:val="6B7280"/>
+          <w:sz w:val="20"/>
+          <w:szCs w:val="20"/>
+        </w:rPr>
+        <w:t xml:space="preserve">• En bref : « le rythme de publication de la HAS ralentit habituellement en juillet-août ; la prochaine vague de publications est attendue à l'automne 2026 » — projection sans source.</w:t>
+      </w:r>
+    </w:p>
+    <w:p>
+      <w:pPr>
+        <w:spacing w:after="80" w:before="0"/>
+        <w:ind w:left="431"/>
+      </w:pPr>
+      <w:r>
+        <w:rPr>
+          <w:rFonts w:ascii="Calibri" w:cs="Calibri" w:eastAsia="Calibri" w:hAnsi="Calibri"/>
+          <w:i/>
+          <w:iCs/>
+          <w:color w:val="6B7280"/>
+          <w:sz w:val="20"/>
+          <w:szCs w:val="20"/>
+        </w:rPr>
+        <w:t xml:space="preserve">• En bref : « publication finale attendue fin 2027 » — la note de cadrage dit « Passage en commission : 4ème trimestre 2027 ».</w:t>
+      </w:r>
+    </w:p>
+    <w:p>
+      <w:pPr>
+        <w:spacing w:after="80" w:before="0"/>
+        <w:ind w:left="431"/>
+      </w:pPr>
+      <w:r>
+        <w:rPr>
+          <w:rFonts w:ascii="Calibri" w:cs="Calibri" w:eastAsia="Calibri" w:hAnsi="Calibri"/>
+          <w:i/>
+          <w:iCs/>
+          <w:color w:val="6B7280"/>
+          <w:sz w:val="20"/>
+          <w:szCs w:val="20"/>
+        </w:rPr>
+        <w:t xml:space="preserve">• Rappel : « 27/06/2026 — RBPP sur le plan personnalisé d'accompagnement et le DUI (PPA-DUI) » — HAS : validé le 12 mai 2026, mis en ligne le 24 juin 2026 ; 27/06 est la date du fichier 2026-06-27_veille_rbpp_ppa-dui.docx.</w:t>
+      </w:r>
+    </w:p>
+    <w:p>
+      <w:pPr>
+        <w:spacing w:after="80" w:before="0"/>
+        <w:ind w:left="431"/>
+      </w:pPr>
+      <w:r>
+        <w:rPr>
+          <w:rFonts w:ascii="Calibri" w:cs="Calibri" w:eastAsia="Calibri" w:hAnsi="Calibri"/>
+          <w:i/>
+          <w:iCs/>
+          <w:color w:val="6B7280"/>
+          <w:sz w:val="20"/>
+          <w:szCs w:val="20"/>
+        </w:rPr>
+        <w:t xml:space="preserve">• Rappel : « 06/06/2026 — RBPP Autisme – recommandations mises à jour » — HAS : validée le 08 janvier 2026, mise en ligne le 12 février 2026 ; 06/06 est la date du fichier de veille.</w:t>
+      </w:r>
+    </w:p>
+    <w:p>
+      <w:pPr>
+        <w:spacing w:after="80" w:before="0"/>
+        <w:ind w:left="431"/>
+      </w:pPr>
+      <w:r>
+        <w:rPr>
+          <w:rFonts w:ascii="Calibri" w:cs="Calibri" w:eastAsia="Calibri" w:hAnsi="Calibri"/>
+          <w:i/>
+          <w:iCs/>
+          <w:color w:val="6B7280"/>
+          <w:sz w:val="20"/>
+          <w:szCs w:val="20"/>
+        </w:rPr>
+        <w:t xml:space="preserve">• Rappel : « 15/06/2026 — RBPP Habitat volet 2 » — HAS : validée le 04 novembre 2025, mise en ligne le 25 novembre 2025 ; 15/06 est la date du fichier de veille.</w:t>
+      </w:r>
+    </w:p>
+    <w:p>
+      <w:pPr>
+        <w:spacing w:after="80" w:before="0"/>
+        <w:ind w:left="431"/>
+      </w:pPr>
+      <w:r>
+        <w:rPr>
+          <w:rFonts w:ascii="Calibri" w:cs="Calibri" w:eastAsia="Calibri" w:hAnsi="Calibri"/>
+          <w:i/>
+          <w:iCs/>
+          <w:color w:val="6B7280"/>
+          <w:sz w:val="20"/>
+          <w:szCs w:val="20"/>
+        </w:rPr>
+        <w:t xml:space="preserve">• Rappel : « 22/06/2026 — RBPP sur la vie intime, affective et sexuelle (volet 1 – socle transversal) [rectif : publication initiale 12/02/2025 ; dernière actualisation 22/06/2026] » — la page HAS porte « Mise à jour 14/11/2025 » ; 22/06/2026 est la date du fichier de veille, et la « rectification » réintroduisait l'erreur qu'elle corrigeait.</w:t>
+      </w:r>
+    </w:p>
+    <w:p>
+      <w:pPr>
+        <w:spacing w:after="80" w:before="0"/>
+        <w:ind w:left="431"/>
+      </w:pPr>
+      <w:r>
+        <w:rPr>
+          <w:rFonts w:ascii="Calibri" w:cs="Calibri" w:eastAsia="Calibri" w:hAnsi="Calibri"/>
+          <w:i/>
+          <w:iCs/>
+          <w:color w:val="6B7280"/>
+          <w:sz w:val="20"/>
+          <w:szCs w:val="20"/>
+        </w:rPr>
+        <w:t xml:space="preserve">• Sources : le guide PPA-DUI, la RBPP autisme, la RBPP habitat volet 2 et l'article des 22 ans étaient cités sans lien ; pages ajoutées, avec le flux RSS.</w:t>
       </w:r>
     </w:p>
     <w:sectPr>

</xml_diff>